<commit_message>
C client configuration p1
</commit_message>
<xml_diff>
--- a/Notes.docx
+++ b/Notes.docx
@@ -98,10 +98,33 @@
     <w:p/>
     <w:p>
       <w:r>
-        <w:t xml:space="preserve">TCP sends data as a continuous stream of bytes, so a single encrypted message may arrive split across multiple recv() calls or multiple messages may arrive together. </w:t>
-      </w:r>
-      <w:r>
-        <w:t xml:space="preserve">And the newline delimiter cannot be identified in it’s encrypted form, so we can’t identify when a packet ends. </w:t>
+        <w:t xml:space="preserve">TCP sends data as a continuous stream of bytes, so a single encrypted message may arrive split across multiple </w:t>
+      </w:r>
+      <w:proofErr w:type="spellStart"/>
+      <w:proofErr w:type="gramStart"/>
+      <w:r>
+        <w:t>recv</w:t>
+      </w:r>
+      <w:proofErr w:type="spellEnd"/>
+      <w:r>
+        <w:t>(</w:t>
+      </w:r>
+      <w:proofErr w:type="gramEnd"/>
+      <w:r>
+        <w:t xml:space="preserve">) calls or multiple messages may arrive together. </w:t>
+      </w:r>
+      <w:r>
+        <w:t xml:space="preserve">And the newline delimiter cannot be identified in </w:t>
+      </w:r>
+      <w:proofErr w:type="spellStart"/>
+      <w:proofErr w:type="gramStart"/>
+      <w:r>
+        <w:t>it’s</w:t>
+      </w:r>
+      <w:proofErr w:type="spellEnd"/>
+      <w:proofErr w:type="gramEnd"/>
+      <w:r>
+        <w:t xml:space="preserve"> encrypted form, so we can’t identify when a packet ends. </w:t>
       </w:r>
       <w:r>
         <w:t xml:space="preserve">We therefore replaced newline delimiters with a </w:t>
@@ -152,7 +175,28 @@
         <w:t>Server:</w:t>
       </w:r>
       <w:r>
-        <w:t xml:space="preserve"> Loads the device's permanent 256-bit ChaCha key from registered_devices.json. </w:t>
+        <w:t xml:space="preserve"> Loads the device's permanent 256-bit </w:t>
+      </w:r>
+      <w:proofErr w:type="spellStart"/>
+      <w:r>
+        <w:t>ChaCha</w:t>
+      </w:r>
+      <w:proofErr w:type="spellEnd"/>
+      <w:r>
+        <w:t xml:space="preserve"> key from </w:t>
+      </w:r>
+      <w:proofErr w:type="spellStart"/>
+      <w:r>
+        <w:t>registered_</w:t>
+      </w:r>
+      <w:proofErr w:type="gramStart"/>
+      <w:r>
+        <w:t>devices.json</w:t>
+      </w:r>
+      <w:proofErr w:type="spellEnd"/>
+      <w:proofErr w:type="gramEnd"/>
+      <w:r>
+        <w:t xml:space="preserve">. </w:t>
       </w:r>
     </w:p>
     <w:p>
@@ -170,7 +214,28 @@
         <w:t>Client:</w:t>
       </w:r>
       <w:r>
-        <w:t xml:space="preserve"> Loads the same permanent 256-bit ChaCha key from client_keys.json (which it stored during registration).</w:t>
+        <w:t xml:space="preserve"> Loads the same permanent 256-bit </w:t>
+      </w:r>
+      <w:proofErr w:type="spellStart"/>
+      <w:r>
+        <w:t>ChaCha</w:t>
+      </w:r>
+      <w:proofErr w:type="spellEnd"/>
+      <w:r>
+        <w:t xml:space="preserve"> key from </w:t>
+      </w:r>
+      <w:proofErr w:type="spellStart"/>
+      <w:r>
+        <w:t>client_</w:t>
+      </w:r>
+      <w:proofErr w:type="gramStart"/>
+      <w:r>
+        <w:t>keys.json</w:t>
+      </w:r>
+      <w:proofErr w:type="spellEnd"/>
+      <w:proofErr w:type="gramEnd"/>
+      <w:r>
+        <w:t xml:space="preserve"> (which it stored during registration).</w:t>
       </w:r>
     </w:p>
     <w:p/>
@@ -263,7 +328,15 @@
         </w:numPr>
       </w:pPr>
       <w:r>
-        <w:t>After a successful login, any protected message (KEY_UPDATE, later ALIVE?, etc.) is encrypted using the client's permanent 256-bit ChaCha20 key.</w:t>
+        <w:t xml:space="preserve">After a successful login, any protected message (KEY_UPDATE, later </w:t>
+      </w:r>
+      <w:proofErr w:type="gramStart"/>
+      <w:r>
+        <w:t>ALIVE?,</w:t>
+      </w:r>
+      <w:proofErr w:type="gramEnd"/>
+      <w:r>
+        <w:t xml:space="preserve"> etc.) is encrypted using the client's permanent 256-bit ChaCha20 key.</w:t>
       </w:r>
     </w:p>
     <w:p>
@@ -305,7 +378,20 @@
         </w:numPr>
       </w:pPr>
       <w:r>
-        <w:t>If it's encrypted (0x01), decrypt it using the permanent 256-bit ChaCha20 key loaded from client_keys.json, then process the resulting plaintext message exactly as before.</w:t>
+        <w:t xml:space="preserve">If it's encrypted (0x01), decrypt it using the permanent 256-bit ChaCha20 key loaded from </w:t>
+      </w:r>
+      <w:proofErr w:type="spellStart"/>
+      <w:r>
+        <w:t>client_</w:t>
+      </w:r>
+      <w:proofErr w:type="gramStart"/>
+      <w:r>
+        <w:t>keys.json</w:t>
+      </w:r>
+      <w:proofErr w:type="spellEnd"/>
+      <w:proofErr w:type="gramEnd"/>
+      <w:r>
+        <w:t>, then process the resulting plaintext message exactly as before.</w:t>
       </w:r>
     </w:p>
     <w:p>
@@ -432,12 +518,32 @@
         </w:numPr>
       </w:pPr>
       <w:r>
-        <w:t>If it's encrypted (0x01), look up the client's permanent ChaCha20 key from connected_clients, decrypt the payload, and then process the resulting plaintext command exactly as before.</w:t>
+        <w:t xml:space="preserve">If it's encrypted (0x01), look up the client's permanent ChaCha20 key from </w:t>
+      </w:r>
+      <w:proofErr w:type="spellStart"/>
+      <w:r>
+        <w:t>connected_clients</w:t>
+      </w:r>
+      <w:proofErr w:type="spellEnd"/>
+      <w:r>
+        <w:t>, decrypt the payload, and then process the resulting plaintext command exactly as before.</w:t>
       </w:r>
     </w:p>
     <w:p/>
     <w:p/>
-    <w:p/>
+    <w:p>
+      <w:r>
+        <w:t>Authenti</w:t>
+      </w:r>
+      <w:r>
+        <w:t>cation Key Verification</w:t>
+      </w:r>
+    </w:p>
+    <w:p>
+      <w:r>
+        <w:t>Every protected client → server request now prepends the current 32-bit authentication key before encryption, and after decryption the server verifies it against its latest stored key before executing the command.</w:t>
+      </w:r>
+    </w:p>
     <w:p/>
     <w:p/>
     <w:p/>

</xml_diff>